<commit_message>
SWOT analysisSWSWOT analysisOT analysis
Conducting the SWOT analysis required spending time reading and researching many aspects of the company.
</commit_message>
<xml_diff>
--- a/CA-3.docx
+++ b/CA-3.docx
@@ -8,6 +8,18 @@
           <w:lang w:val="mn-MN"/>
         </w:rPr>
       </w:pPr>
+      <w:r>
+        <w:rPr>
+          <w:lang w:val="mn-MN"/>
+        </w:rPr>
+        <w:t>gbfd</w:t>
+      </w:r>
+      <w:r>
+        <w:rPr>
+          <w:lang w:val="mn-MN"/>
+        </w:rPr>
+        <w:t>njn</w:t>
+      </w:r>
       <w:r>
         <w:rPr>
           <w:lang w:val="mn-MN"/>

</xml_diff>